<commit_message>
Fix Period Close Agent lab flow counts and references
- Lab guide and wizard: eight flows (adds PCA - Wait and PCA - Export trial
  balance) and eight connection references, matching the 1.1.0.0 package;
  affected screenshots updated.
- Lab README lists only folders that exist.
- Agent Core evaluation CSVs: remove a reference to a file that is not part
  of the package.

Co-authored-by: Copilot <223556219+Copilot@users.noreply.github.com>
Copilot-Session: a83c4914-6576-4ac2-9360-fbed7bcf5534
</commit_message>
<xml_diff>
--- a/Agents/AI ERP Agents/Period Close Agent/HOL/HOL_PeriodCloseAgent_External.docx
+++ b/Agents/AI ERP Agents/Period Close Agent/HOL/HOL_PeriodCloseAgent_External.docx
@@ -1962,7 +1962,7 @@
               <w:cnfStyle w:val="000000100000" w:firstRow="0" w:lastRow="0" w:firstColumn="0" w:lastColumn="0" w:oddVBand="0" w:evenVBand="0" w:oddHBand="1" w:evenHBand="0" w:firstRowFirstColumn="0" w:firstRowLastColumn="0" w:lastRowFirstColumn="0" w:lastRowLastColumn="0"/>
             </w:pPr>
             <w:r>
-              <w:t>6 flows prefixed PCA</w:t>
+              <w:t>8 flows prefixed PCA</w:t>
             </w:r>
           </w:p>
         </w:tc>
@@ -1975,7 +1975,7 @@
               <w:cnfStyle w:val="000000100000" w:firstRow="0" w:lastRow="0" w:firstColumn="0" w:lastColumn="0" w:oddVBand="0" w:evenVBand="0" w:oddHBand="1" w:evenHBand="0" w:firstRowFirstColumn="0" w:firstRowLastColumn="0" w:lastRowFirstColumn="0" w:lastRowLastColumn="0"/>
             </w:pPr>
             <w:r>
-              <w:t>Mark task started, Mark task completed, Record task audit, Retrieve close plan, plus two triggers that start the agent when a task is completed or started by a person.</w:t>
+              <w:t>Mark task started, Mark task completed, Record task audit, Retrieve close plan, Wait, Export trial balance, plus two triggers that start the agent when a task is completed or started by a person.</w:t>
             </w:r>
           </w:p>
         </w:tc>
@@ -5027,7 +5027,7 @@
     </w:p>
     <w:p>
       <w:r>
-        <w:t>The Connections page lists 9 connection references. Each needs a connection signed in with your own lab credentials.</w:t>
+        <w:t>The Connections page lists 8 connection references. Each needs a connection signed in with your own lab credentials.</w:t>
       </w:r>
     </w:p>
     <w:p>
@@ -5051,7 +5051,7 @@
         <w:pStyle w:val="ListBullet"/>
       </w:pPr>
       <w:r>
-        <w:t>Repeat until all 9 connection references show a green check, and then select Import.</w:t>
+        <w:t>Repeat until all 8 connection references show a green check, and then select Import.</w:t>
       </w:r>
     </w:p>
     <w:p>
@@ -5064,7 +5064,7 @@
           <wp:inline distT="0" distB="0" distL="0" distR="0" wp14:anchorId="581C8B8F" wp14:editId="2BF7A130">
             <wp:extent cx="3840480" cy="4147017"/>
             <wp:effectExtent l="0" t="0" r="0" b="0"/>
-            <wp:docPr id="758726856" name="drawing" descr="Connections page with all nine connection references ready"/>
+            <wp:docPr id="758726856" name="drawing" descr="Connections page with all eight connection references ready"/>
             <wp:cNvGraphicFramePr>
               <a:graphicFrameLocks xmlns:a="http://schemas.openxmlformats.org/drawingml/2006/main" noChangeAspect="1"/>
             </wp:cNvGraphicFramePr>
@@ -5109,7 +5109,7 @@
           <w:sz w:val="18"/>
           <w:szCs w:val="18"/>
         </w:rPr>
-        <w:t>Figure: Connections page with all nine connection references ready</w:t>
+        <w:t>Figure: Connections page with all eight connection references ready</w:t>
       </w:r>
     </w:p>
     <w:tbl>
@@ -6195,7 +6195,7 @@
     </w:p>
     <w:p>
       <w:r>
-        <w:t>The solution contains six Power Automate flows. Four are called by the agent as tools and are turned on during import. The two flows that react to changes on the closing schedule are imported turned off, and you turn them on in this step.</w:t>
+        <w:t>The solution contains eight Power Automate flows. Six are called by the agent as tools and are turned on during import. The two flows that react to changes on the closing schedule are imported turned off, and you turn them on in this step.</w:t>
       </w:r>
     </w:p>
     <w:p>
@@ -6293,7 +6293,7 @@
         <w:pStyle w:val="ListBullet"/>
       </w:pPr>
       <w:r>
-        <w:t>Select Refresh and confirm that all six flows show Status On.</w:t>
+        <w:t>Select Refresh and confirm that all eight flows show Status On.</w:t>
       </w:r>
     </w:p>
     <w:p>
@@ -6303,9 +6303,9 @@
         </w:rPr>
         <w:drawing>
           <wp:inline distT="0" distB="0" distL="0" distR="0" wp14:anchorId="7981F9D4" wp14:editId="0570818D">
-            <wp:extent cx="5486400" cy="1751651"/>
+            <wp:extent cx="5486400" cy="2043820"/>
             <wp:effectExtent l="0" t="0" r="0" b="0"/>
-            <wp:docPr id="372272519" name="drawing" descr="All six PCA flows with Status On"/>
+            <wp:docPr id="372272519" name="drawing" descr="All eight PCA flows with Status On"/>
             <wp:cNvGraphicFramePr>
               <a:graphicFrameLocks xmlns:a="http://schemas.openxmlformats.org/drawingml/2006/main" noChangeAspect="1"/>
             </wp:cNvGraphicFramePr>
@@ -6325,7 +6325,7 @@
                   <pic:spPr>
                     <a:xfrm>
                       <a:off x="0" y="0"/>
-                      <a:ext cx="5486400" cy="1751651"/>
+                      <a:ext cx="5486400" cy="2043820"/>
                     </a:xfrm>
                     <a:prstGeom prst="rect">
                       <a:avLst/>
@@ -6350,7 +6350,7 @@
           <w:sz w:val="18"/>
           <w:szCs w:val="18"/>
         </w:rPr>
-        <w:t>Figure: All six PCA flows with Status On</w:t>
+        <w:t>Figure: All eight PCA flows with Status On</w:t>
       </w:r>
     </w:p>
     <w:tbl>
@@ -6565,6 +6565,84 @@
             </w:pPr>
             <w:r>
               <w:t>Writes one record per task attempt to the Period Close Task Audit table</w:t>
+            </w:r>
+          </w:p>
+        </w:tc>
+      </w:tr>
+      <w:tr>
+        <w:tc>
+          <w:tcPr>
+            <w:cnfStyle w:val="001000000000" w:firstRow="0" w:lastRow="0" w:firstColumn="1" w:lastColumn="0" w:oddVBand="0" w:evenVBand="0" w:oddHBand="0" w:evenHBand="0" w:firstRowFirstColumn="0" w:firstRowLastColumn="0" w:lastRowFirstColumn="0" w:lastRowLastColumn="0"/>
+            <w:tcW w:w="3300" w:type="dxa"/>
+          </w:tcPr>
+          <w:p>
+            <w:r>
+              <w:t>PCA - Wait</w:t>
+            </w:r>
+          </w:p>
+        </w:tc>
+        <w:tc>
+          <w:tcPr>
+            <w:tcW w:w="2100" w:type="dxa"/>
+          </w:tcPr>
+          <w:p>
+            <w:pPr>
+              <w:cnfStyle w:val="000000000000" w:firstRow="0" w:lastRow="0" w:firstColumn="0" w:lastColumn="0" w:oddVBand="0" w:evenVBand="0" w:oddHBand="0" w:evenHBand="0" w:firstRowFirstColumn="0" w:firstRowLastColumn="0" w:lastRowFirstColumn="0" w:lastRowLastColumn="0"/>
+            </w:pPr>
+            <w:r>
+              <w:t>The agent (tool)</w:t>
+            </w:r>
+          </w:p>
+        </w:tc>
+        <w:tc>
+          <w:tcPr>
+            <w:tcW w:w="3960" w:type="dxa"/>
+          </w:tcPr>
+          <w:p>
+            <w:pPr>
+              <w:cnfStyle w:val="000000000000" w:firstRow="0" w:lastRow="0" w:firstColumn="0" w:lastColumn="0" w:oddVBand="0" w:evenVBand="0" w:oddHBand="0" w:evenHBand="0" w:firstRowFirstColumn="0" w:firstRowLastColumn="0" w:lastRowFirstColumn="0" w:lastRowLastColumn="0"/>
+            </w:pPr>
+            <w:r>
+              <w:t>Pauses 5 to 60 seconds between status checks while the trial balance export waits for the snapshot</w:t>
+            </w:r>
+          </w:p>
+        </w:tc>
+      </w:tr>
+      <w:tr>
+        <w:tc>
+          <w:tcPr>
+            <w:cnfStyle w:val="001000000000" w:firstRow="0" w:lastRow="0" w:firstColumn="1" w:lastColumn="0" w:oddVBand="0" w:evenVBand="0" w:oddHBand="0" w:evenHBand="0" w:firstRowFirstColumn="0" w:firstRowLastColumn="0" w:lastRowFirstColumn="0" w:lastRowLastColumn="0"/>
+            <w:tcW w:w="3300" w:type="dxa"/>
+          </w:tcPr>
+          <w:p>
+            <w:r>
+              <w:t>PCA - Export trial balance</w:t>
+            </w:r>
+          </w:p>
+        </w:tc>
+        <w:tc>
+          <w:tcPr>
+            <w:tcW w:w="2100" w:type="dxa"/>
+          </w:tcPr>
+          <w:p>
+            <w:pPr>
+              <w:cnfStyle w:val="000000000000" w:firstRow="0" w:lastRow="0" w:firstColumn="0" w:lastColumn="0" w:oddVBand="0" w:evenVBand="0" w:oddHBand="0" w:evenHBand="0" w:firstRowFirstColumn="0" w:firstRowLastColumn="0" w:lastRowFirstColumn="0" w:lastRowLastColumn="0"/>
+            </w:pPr>
+            <w:r>
+              <w:t>The agent (tool)</w:t>
+            </w:r>
+          </w:p>
+        </w:tc>
+        <w:tc>
+          <w:tcPr>
+            <w:tcW w:w="3960" w:type="dxa"/>
+          </w:tcPr>
+          <w:p>
+            <w:pPr>
+              <w:cnfStyle w:val="000000000000" w:firstRow="0" w:lastRow="0" w:firstColumn="0" w:lastColumn="0" w:oddVBand="0" w:evenVBand="0" w:oddHBand="0" w:evenHBand="0" w:firstRowFirstColumn="0" w:firstRowLastColumn="0" w:lastRowFirstColumn="0" w:lastRowLastColumn="0"/>
+            </w:pPr>
+            <w:r>
+              <w:t>Builds the trial balance CSV and HTML dashboard and saves both to SharePoint</w:t>
             </w:r>
           </w:p>
         </w:tc>
@@ -7277,7 +7355,7 @@
               <w:cnfStyle w:val="000000100000" w:firstRow="0" w:lastRow="0" w:firstColumn="0" w:lastColumn="0" w:oddVBand="0" w:evenVBand="0" w:oddHBand="1" w:evenHBand="0" w:firstRowFirstColumn="0" w:firstRowLastColumn="0" w:lastRowFirstColumn="0" w:lastRowLastColumn="0"/>
             </w:pPr>
             <w:r>
-              <w:t>Dynamics 365 ERP MCP, Dynamics 365 ERP Analytics MCP (Preview), Dataverse MCP Server, SharePoint and Mail, plus the four PCA flows (Mark task started, Mark task completed, Record task audit, Retrieve informational close plan). Select +4 to see the rest.</w:t>
+              <w:t>Dynamics 365 ERP MCP, Dynamics 365 ERP Analytics MCP (Preview), Dataverse MCP Server, SharePoint and Mail, plus the six PCA agent flows (Mark task started, Mark task completed, Record task audit, Retrieve informational close plan, Wait, Export trial balance). Select the + count to see the rest.</w:t>
             </w:r>
           </w:p>
         </w:tc>

</xml_diff>

<commit_message>
Fix Period Close Agent lab flow counts and references (#577)
- Lab guide and wizard: eight flows (adds PCA - Wait and PCA - Export trial
  balance) and eight connection references, matching the 1.1.0.0 package;
  affected screenshots updated.
- Lab README lists only folders that exist.
- Agent Core evaluation CSVs: remove a reference to a file that is not part
  of the package.

Co-authored-by: Copilot <223556219+Copilot@users.noreply.github.com>
Copilot-Session: a83c4914-6576-4ac2-9360-fbed7bcf5534
</commit_message>
<xml_diff>
--- a/Agents/AI ERP Agents/Period Close Agent/HOL/HOL_PeriodCloseAgent_External.docx
+++ b/Agents/AI ERP Agents/Period Close Agent/HOL/HOL_PeriodCloseAgent_External.docx
@@ -1962,7 +1962,7 @@
               <w:cnfStyle w:val="000000100000" w:firstRow="0" w:lastRow="0" w:firstColumn="0" w:lastColumn="0" w:oddVBand="0" w:evenVBand="0" w:oddHBand="1" w:evenHBand="0" w:firstRowFirstColumn="0" w:firstRowLastColumn="0" w:lastRowFirstColumn="0" w:lastRowLastColumn="0"/>
             </w:pPr>
             <w:r>
-              <w:t>6 flows prefixed PCA</w:t>
+              <w:t>8 flows prefixed PCA</w:t>
             </w:r>
           </w:p>
         </w:tc>
@@ -1975,7 +1975,7 @@
               <w:cnfStyle w:val="000000100000" w:firstRow="0" w:lastRow="0" w:firstColumn="0" w:lastColumn="0" w:oddVBand="0" w:evenVBand="0" w:oddHBand="1" w:evenHBand="0" w:firstRowFirstColumn="0" w:firstRowLastColumn="0" w:lastRowFirstColumn="0" w:lastRowLastColumn="0"/>
             </w:pPr>
             <w:r>
-              <w:t>Mark task started, Mark task completed, Record task audit, Retrieve close plan, plus two triggers that start the agent when a task is completed or started by a person.</w:t>
+              <w:t>Mark task started, Mark task completed, Record task audit, Retrieve close plan, Wait, Export trial balance, plus two triggers that start the agent when a task is completed or started by a person.</w:t>
             </w:r>
           </w:p>
         </w:tc>
@@ -5027,7 +5027,7 @@
     </w:p>
     <w:p>
       <w:r>
-        <w:t>The Connections page lists 9 connection references. Each needs a connection signed in with your own lab credentials.</w:t>
+        <w:t>The Connections page lists 8 connection references. Each needs a connection signed in with your own lab credentials.</w:t>
       </w:r>
     </w:p>
     <w:p>
@@ -5051,7 +5051,7 @@
         <w:pStyle w:val="ListBullet"/>
       </w:pPr>
       <w:r>
-        <w:t>Repeat until all 9 connection references show a green check, and then select Import.</w:t>
+        <w:t>Repeat until all 8 connection references show a green check, and then select Import.</w:t>
       </w:r>
     </w:p>
     <w:p>
@@ -5064,7 +5064,7 @@
           <wp:inline distT="0" distB="0" distL="0" distR="0" wp14:anchorId="581C8B8F" wp14:editId="2BF7A130">
             <wp:extent cx="3840480" cy="4147017"/>
             <wp:effectExtent l="0" t="0" r="0" b="0"/>
-            <wp:docPr id="758726856" name="drawing" descr="Connections page with all nine connection references ready"/>
+            <wp:docPr id="758726856" name="drawing" descr="Connections page with all eight connection references ready"/>
             <wp:cNvGraphicFramePr>
               <a:graphicFrameLocks xmlns:a="http://schemas.openxmlformats.org/drawingml/2006/main" noChangeAspect="1"/>
             </wp:cNvGraphicFramePr>
@@ -5109,7 +5109,7 @@
           <w:sz w:val="18"/>
           <w:szCs w:val="18"/>
         </w:rPr>
-        <w:t>Figure: Connections page with all nine connection references ready</w:t>
+        <w:t>Figure: Connections page with all eight connection references ready</w:t>
       </w:r>
     </w:p>
     <w:tbl>
@@ -6195,7 +6195,7 @@
     </w:p>
     <w:p>
       <w:r>
-        <w:t>The solution contains six Power Automate flows. Four are called by the agent as tools and are turned on during import. The two flows that react to changes on the closing schedule are imported turned off, and you turn them on in this step.</w:t>
+        <w:t>The solution contains eight Power Automate flows. Six are called by the agent as tools and are turned on during import. The two flows that react to changes on the closing schedule are imported turned off, and you turn them on in this step.</w:t>
       </w:r>
     </w:p>
     <w:p>
@@ -6293,7 +6293,7 @@
         <w:pStyle w:val="ListBullet"/>
       </w:pPr>
       <w:r>
-        <w:t>Select Refresh and confirm that all six flows show Status On.</w:t>
+        <w:t>Select Refresh and confirm that all eight flows show Status On.</w:t>
       </w:r>
     </w:p>
     <w:p>
@@ -6303,9 +6303,9 @@
         </w:rPr>
         <w:drawing>
           <wp:inline distT="0" distB="0" distL="0" distR="0" wp14:anchorId="7981F9D4" wp14:editId="0570818D">
-            <wp:extent cx="5486400" cy="1751651"/>
+            <wp:extent cx="5486400" cy="2043820"/>
             <wp:effectExtent l="0" t="0" r="0" b="0"/>
-            <wp:docPr id="372272519" name="drawing" descr="All six PCA flows with Status On"/>
+            <wp:docPr id="372272519" name="drawing" descr="All eight PCA flows with Status On"/>
             <wp:cNvGraphicFramePr>
               <a:graphicFrameLocks xmlns:a="http://schemas.openxmlformats.org/drawingml/2006/main" noChangeAspect="1"/>
             </wp:cNvGraphicFramePr>
@@ -6325,7 +6325,7 @@
                   <pic:spPr>
                     <a:xfrm>
                       <a:off x="0" y="0"/>
-                      <a:ext cx="5486400" cy="1751651"/>
+                      <a:ext cx="5486400" cy="2043820"/>
                     </a:xfrm>
                     <a:prstGeom prst="rect">
                       <a:avLst/>
@@ -6350,7 +6350,7 @@
           <w:sz w:val="18"/>
           <w:szCs w:val="18"/>
         </w:rPr>
-        <w:t>Figure: All six PCA flows with Status On</w:t>
+        <w:t>Figure: All eight PCA flows with Status On</w:t>
       </w:r>
     </w:p>
     <w:tbl>
@@ -6565,6 +6565,84 @@
             </w:pPr>
             <w:r>
               <w:t>Writes one record per task attempt to the Period Close Task Audit table</w:t>
+            </w:r>
+          </w:p>
+        </w:tc>
+      </w:tr>
+      <w:tr>
+        <w:tc>
+          <w:tcPr>
+            <w:cnfStyle w:val="001000000000" w:firstRow="0" w:lastRow="0" w:firstColumn="1" w:lastColumn="0" w:oddVBand="0" w:evenVBand="0" w:oddHBand="0" w:evenHBand="0" w:firstRowFirstColumn="0" w:firstRowLastColumn="0" w:lastRowFirstColumn="0" w:lastRowLastColumn="0"/>
+            <w:tcW w:w="3300" w:type="dxa"/>
+          </w:tcPr>
+          <w:p>
+            <w:r>
+              <w:t>PCA - Wait</w:t>
+            </w:r>
+          </w:p>
+        </w:tc>
+        <w:tc>
+          <w:tcPr>
+            <w:tcW w:w="2100" w:type="dxa"/>
+          </w:tcPr>
+          <w:p>
+            <w:pPr>
+              <w:cnfStyle w:val="000000000000" w:firstRow="0" w:lastRow="0" w:firstColumn="0" w:lastColumn="0" w:oddVBand="0" w:evenVBand="0" w:oddHBand="0" w:evenHBand="0" w:firstRowFirstColumn="0" w:firstRowLastColumn="0" w:lastRowFirstColumn="0" w:lastRowLastColumn="0"/>
+            </w:pPr>
+            <w:r>
+              <w:t>The agent (tool)</w:t>
+            </w:r>
+          </w:p>
+        </w:tc>
+        <w:tc>
+          <w:tcPr>
+            <w:tcW w:w="3960" w:type="dxa"/>
+          </w:tcPr>
+          <w:p>
+            <w:pPr>
+              <w:cnfStyle w:val="000000000000" w:firstRow="0" w:lastRow="0" w:firstColumn="0" w:lastColumn="0" w:oddVBand="0" w:evenVBand="0" w:oddHBand="0" w:evenHBand="0" w:firstRowFirstColumn="0" w:firstRowLastColumn="0" w:lastRowFirstColumn="0" w:lastRowLastColumn="0"/>
+            </w:pPr>
+            <w:r>
+              <w:t>Pauses 5 to 60 seconds between status checks while the trial balance export waits for the snapshot</w:t>
+            </w:r>
+          </w:p>
+        </w:tc>
+      </w:tr>
+      <w:tr>
+        <w:tc>
+          <w:tcPr>
+            <w:cnfStyle w:val="001000000000" w:firstRow="0" w:lastRow="0" w:firstColumn="1" w:lastColumn="0" w:oddVBand="0" w:evenVBand="0" w:oddHBand="0" w:evenHBand="0" w:firstRowFirstColumn="0" w:firstRowLastColumn="0" w:lastRowFirstColumn="0" w:lastRowLastColumn="0"/>
+            <w:tcW w:w="3300" w:type="dxa"/>
+          </w:tcPr>
+          <w:p>
+            <w:r>
+              <w:t>PCA - Export trial balance</w:t>
+            </w:r>
+          </w:p>
+        </w:tc>
+        <w:tc>
+          <w:tcPr>
+            <w:tcW w:w="2100" w:type="dxa"/>
+          </w:tcPr>
+          <w:p>
+            <w:pPr>
+              <w:cnfStyle w:val="000000000000" w:firstRow="0" w:lastRow="0" w:firstColumn="0" w:lastColumn="0" w:oddVBand="0" w:evenVBand="0" w:oddHBand="0" w:evenHBand="0" w:firstRowFirstColumn="0" w:firstRowLastColumn="0" w:lastRowFirstColumn="0" w:lastRowLastColumn="0"/>
+            </w:pPr>
+            <w:r>
+              <w:t>The agent (tool)</w:t>
+            </w:r>
+          </w:p>
+        </w:tc>
+        <w:tc>
+          <w:tcPr>
+            <w:tcW w:w="3960" w:type="dxa"/>
+          </w:tcPr>
+          <w:p>
+            <w:pPr>
+              <w:cnfStyle w:val="000000000000" w:firstRow="0" w:lastRow="0" w:firstColumn="0" w:lastColumn="0" w:oddVBand="0" w:evenVBand="0" w:oddHBand="0" w:evenHBand="0" w:firstRowFirstColumn="0" w:firstRowLastColumn="0" w:lastRowFirstColumn="0" w:lastRowLastColumn="0"/>
+            </w:pPr>
+            <w:r>
+              <w:t>Builds the trial balance CSV and HTML dashboard and saves both to SharePoint</w:t>
             </w:r>
           </w:p>
         </w:tc>
@@ -7277,7 +7355,7 @@
               <w:cnfStyle w:val="000000100000" w:firstRow="0" w:lastRow="0" w:firstColumn="0" w:lastColumn="0" w:oddVBand="0" w:evenVBand="0" w:oddHBand="1" w:evenHBand="0" w:firstRowFirstColumn="0" w:firstRowLastColumn="0" w:lastRowFirstColumn="0" w:lastRowLastColumn="0"/>
             </w:pPr>
             <w:r>
-              <w:t>Dynamics 365 ERP MCP, Dynamics 365 ERP Analytics MCP (Preview), Dataverse MCP Server, SharePoint and Mail, plus the four PCA flows (Mark task started, Mark task completed, Record task audit, Retrieve informational close plan). Select +4 to see the rest.</w:t>
+              <w:t>Dynamics 365 ERP MCP, Dynamics 365 ERP Analytics MCP (Preview), Dataverse MCP Server, SharePoint and Mail, plus the six PCA agent flows (Mark task started, Mark task completed, Record task audit, Retrieve informational close plan, Wait, Export trial balance). Select the + count to see the rest.</w:t>
             </w:r>
           </w:p>
         </w:tc>

</xml_diff>